<commit_message>
Diseño: estados del turno, transiciones y diagramas Mermaid
</commit_message>
<xml_diff>
--- a/docs/Trabajo Final IntegradorV2.docx
+++ b/docs/Trabajo Final IntegradorV2.docx
@@ -2129,7 +2129,7 @@
         <w:rPr>
           <w:b w:val="0"/>
         </w:rPr>
-        <w:t>Gestionar altas, modificaciones, cancelaciones y estados de los turnos. Los turnos se crean como PENDIENTE, pasan a CONFIRMADO cuando la profesional los acepta y a CANCELADO cuando se anulan.</w:t>
+        <w:t>Gestionar altas, modificaciones, cancelaciones y estados de los turnos. Los turnos se crean como PENDIENTE, pasan a CONFIRMADO cuando la profesional los acepta, a REALIZADO cuando se atienden y a AUSENTE cuando el paciente no se presenta, y a CANCELADO cuando se anulan.</w:t>
       </w:r>
     </w:p>
     <w:p>
@@ -4925,6 +4925,89 @@
           <w:lang w:val="es-AR"/>
         </w:rPr>
       </w:pPr>
+    </w:p>
+    <w:p>
+      <w:pPr>
+        <w:pStyle w:val="Heading1"/>
+      </w:pPr>
+      <w:r>
+        <w:t xml:space="preserve">Decisiones de diseno sobre el modelo de datos</w:t>
+      </w:r>
+    </w:p>
+    <w:p>
+      <w:r>
+        <w:t xml:space="preserve">Estas decisiones se tomaron despues de una revision critica del modelo generado como borrador, y quedan incorporadas tanto en database/schema.sql como en la documentacion Markdown del repositorio.</w:t>
+      </w:r>
+    </w:p>
+    <w:p>
+      <w:r>
+        <w:t xml:space="preserve">1. Transiciones de estado del turno</w:t>
+      </w:r>
+    </w:p>
+    <w:p>
+      <w:r>
+        <w:t xml:space="preserve">PENDIENTE puede pasar a CONFIRMADO o a CANCELADO. CONFIRMADO puede pasar a REALIZADO, AUSENTE o CANCELADO.</w:t>
+      </w:r>
+    </w:p>
+    <w:p>
+      <w:r>
+        <w:t xml:space="preserve">CANCELADO, REALIZADO y AUSENTE son estados terminales: no admiten ninguna salida.</w:t>
+      </w:r>
+    </w:p>
+    <w:p>
+      <w:r>
+        <w:t xml:space="preserve">No se admite CONFIRMADO hacia PENDIENTE, porque desconfirmar un turno ya confirmado ensuciaria el historial del paciente. Reprogramar, es decir cambiar la fecha y la hora, si se permite mientras el turno este en PENDIENTE o CONFIRMADO.</w:t>
+      </w:r>
+    </w:p>
+    <w:p>
+      <w:r>
+        <w:t xml:space="preserve">La matriz se valida en la base de datos con el trigger trg_turno_transicion_estado, que rechaza con check_violation cualquier cambio de estado no previsto. Los servicios de aplicacion validan la misma matriz para poder devolver un mensaje de negocio en lugar de una excepcion de SQL.</w:t>
+      </w:r>
+    </w:p>
+    <w:p>
+      <w:r>
+        <w:t xml:space="preserve">2. Vencimiento de reservas sin confirmar</w:t>
+      </w:r>
+    </w:p>
+    <w:p>
+      <w:r>
+        <w:t xml:space="preserve">Un turno PENDIENTE cuya hora de fin ya paso se cierra automaticamente como CANCELADO. La operacion la realiza la funcion fn_cerrar_turnos_vencidos, que el backend invoca de forma periodica y que devuelve cuantos turnos cerro. El cierre deja constancia en observaciones sin pisar lo que ya hubiera y es idempotente.</w:t>
+      </w:r>
+    </w:p>
+    <w:p>
+      <w:r>
+        <w:t xml:space="preserve">Consecuencia asumida: al cerrar al pasar la hora, un turno pasado ya no se puede confirmar. En el historial del paciente, una reserva nunca confirmada figura como CANCELADO y nunca como AUSENTE; AUSENTE queda reservado para los turnos que estaban CONFIRMADO y el paciente no se presento.</w:t>
+      </w:r>
+    </w:p>
+    <w:p>
+      <w:r>
+        <w:t xml:space="preserve">3. Zonas horarias</w:t>
+      </w:r>
+    </w:p>
+    <w:p>
+      <w:r>
+        <w:t xml:space="preserve">Un turno es un instante real en el calendario. Por eso turno.fecha_hora_inicio, turno.fecha_hora_fin, turno.fecha_creacion, turno.fecha_actualizacion y paciente.fecha_creacion se guardan como TIMESTAMPTZ, con zona horaria. El despliegue en Railway corre en UTC: guardar la hora sin zona haria que un turno de las 10:00 se mostrara corrido al cambiar de huso.</w:t>
+      </w:r>
+    </w:p>
+    <w:p>
+      <w:r>
+        <w:t xml:space="preserve">En cambio, agenda_config.hora_inicio y agenda_config.hora_fin siguen siendo TIME, y excepcion_agenda.fecha_inicio y excepcion_agenda.fecha_fin siguen siendo DATE: describen un horario o un dia local, no un instante. En el backend se mapearan con OffsetDateTime, no con LocalDateTime.</w:t>
+      </w:r>
+    </w:p>
+    <w:p>
+      <w:r>
+        <w:t xml:space="preserve">4. Ultima modificacion, no auditoria</w:t>
+      </w:r>
+    </w:p>
+    <w:p>
+      <w:r>
+        <w:t xml:space="preserve">Paciente y Turno registran fecha_creacion, y Turno tiene ademas fecha_actualizacion, mantenida por el trigger trg_turno_fecha_actualizacion porque un DEFAULT CURRENT_TIMESTAMP solo se aplica al insertar.</w:t>
+      </w:r>
+    </w:p>
+    <w:p>
+      <w:r>
+        <w:t xml:space="preserve">Esto es ultima modificacion, no auditoria: la columna no registra quien cambio el turno ni que cambio. Una auditoria real exigiria una tabla de historial, que queda fuera del alcance del MVP.</w:t>
+      </w:r>
     </w:p>
     <w:sectPr>
       <w:headerReference w:type="default" r:id="rId8"/>

</xml_diff>